<commit_message>
Atualiza README, modifica app.py, remove arquivos gerados antigos e atualiza templates
</commit_message>
<xml_diff>
--- a/app/docx_templates/LPH.docx
+++ b/app/docx_templates/LPH.docx
@@ -70,6 +70,14 @@
           <w:sz w:val="20"/>
         </w:rPr>
         <w:t>Admissão:</w:t>
+      </w:r>
+      <w:r>
+        <w:rPr>
+          <w:rFonts w:ascii="Georgia" w:hAnsi="Georgia"/>
+          <w:spacing w:val="-2"/>
+          <w:sz w:val="20"/>
+        </w:rPr>
+        <w:t xml:space="preserve"> {{date_id}}</w:t>
       </w:r>
     </w:p>
     <w:p>
@@ -229,7 +237,16 @@
         <w:ind w:left="141"/>
       </w:pPr>
       <w:r>
-        <w:t>Este documento tem por objetivo informar, conforme a NR 01, que todos os TRABALHADORES do GRUPO LAGOA PARQUES E HOTÉIS tenham ciência do disposto a seguir:</w:t>
+        <w:t xml:space="preserve">Este documento tem por objetivo informar, conforme a NR 01, que todos os TRABALHADORES do </w:t>
+      </w:r>
+      <w:r>
+        <w:rPr>
+          <w:u w:val="single"/>
+        </w:rPr>
+        <w:t>GRUPO</w:t>
+      </w:r>
+      <w:r>
+        <w:t xml:space="preserve"> LAGOA PARQUES E HOTÉIS tenham ciência do disposto a seguir:</w:t>
       </w:r>
     </w:p>
     <w:p>
@@ -6007,37 +6024,13 @@
         <w:t xml:space="preserve">Nesta data, </w:t>
       </w:r>
       <w:r>
-        <w:rPr>
-          <w:rFonts w:ascii="Times New Roman" w:hAnsi="Times New Roman"/>
-          <w:u w:val="single"/>
-        </w:rPr>
-        <w:tab/>
+        <w:t xml:space="preserve"> </w:t>
       </w:r>
       <w:r>
         <w:rPr>
           <w:spacing w:val="-10"/>
         </w:rPr>
-        <w:t>/</w:t>
-      </w:r>
-      <w:r>
-        <w:rPr>
-          <w:rFonts w:ascii="Times New Roman" w:hAnsi="Times New Roman"/>
-          <w:u w:val="single"/>
-        </w:rPr>
-        <w:tab/>
-      </w:r>
-      <w:r>
-        <w:rPr>
-          <w:spacing w:val="-10"/>
-        </w:rPr>
-        <w:t>/</w:t>
-      </w:r>
-      <w:r>
-        <w:rPr>
-          <w:rFonts w:ascii="Times New Roman" w:hAnsi="Times New Roman"/>
-          <w:u w:val="single"/>
-        </w:rPr>
-        <w:tab/>
+        <w:t xml:space="preserve">{{date_id}}  </w:t>
       </w:r>
       <w:r>
         <w:t>,</w:t>

</xml_diff>